<commit_message>
fix(docx): 补写 Normal / DefaultParagraphFont 默认样式，消除 20 处悬空样式引用
起因：用 officecli 的 `view issues` 体检，报 20 处
"Dangling basedOn/next reference: 'Normal'/'DefaultParagraphFont' does not exist"。

核实（不是误报）：styles.xml 定义了 16 个样式，但 Title / Heading1-6 / Strong /
ListParagraph / FootnoteText / EndnoteText 都 basedOn="Normal"，
Hyperlink / FootnoteReference / EndnoteTextChar 等 basedOn="DefaultParagraphFont"，
而这两个默认样式 docx-js 根本没有输出 —— Word 会回退到内置默认值，严格校验器会报错。

修复：在 zip 后处理阶段往 word/styles.xml 注入两个默认样式定义
（w:default="1" 的 Normal 带字体/字号 rPr，DefaultParagraphFont 为 character 默认样式）。

验证：
- officecli view issues：悬空引用 20 → 0；officecli validate 通过
- mammoth 转换 0 警告；H1×7 / H2×39 / 表格×136 不变
- 渲染 PDF 复核：孤立分隔线 0 处，无排版回退
</commit_message>
<xml_diff>
--- a/docx/DSH科研工具手册.docx
+++ b/docx/DSH科研工具手册.docx
@@ -55518,6 +55518,21 @@
       </w:pPr>
     </w:pPrDefault>
   </w:docDefaults>
+  <w:style w:type="paragraph" w:default="1" w:styleId="Normal">
+    <w:name w:val="Normal"/>
+    <w:qFormat/>
+    <w:rPr>
+      <w:rFonts w:ascii="微软雅黑" w:eastAsia="微软雅黑" w:hAnsi="微软雅黑" w:cs="微软雅黑"/>
+      <w:sz w:val="21"/>
+      <w:szCs w:val="21"/>
+    </w:rPr>
+  </w:style>
+  <w:style w:type="character" w:default="1" w:styleId="DefaultParagraphFont">
+    <w:name w:val="Default Paragraph Font"/>
+    <w:uiPriority w:val="1"/>
+    <w:semiHidden/>
+    <w:unhideWhenUsed/>
+  </w:style>
   <w:style w:type="paragraph" w:styleId="Title">
     <w:name w:val="Title"/>
     <w:basedOn w:val="Normal"/>

</xml_diff>